<commit_message>
Documento final del parcial
</commit_message>
<xml_diff>
--- a/documento/Parcial1_IoT_Central.docx
+++ b/documento/Parcial1_IoT_Central.docx
@@ -456,13 +456,29 @@
       </w:r>
     </w:p>
     <w:p>
+      <w:r>
+        <w:rPr>
+          <w:b w:val="0"/>
+        </w:rPr>
+        <w:t>Se tiene la siguiente arquitectura para la infraestructura digital de la finca de cacao, teniendo en cuenta los dispositivos, los métodos de comunicación y los servicios de la nube. En esta versión del proyecto no existe una infraestructura física, por lo que los sensores son simulados, aunque la arquitectura describe su implementación física.</w:t>
+      </w:r>
+    </w:p>
+    <w:p>
+      <w:pPr>
+        <w:pStyle w:val="Heading2"/>
+      </w:pPr>
+      <w:r>
+        <w:t>Arquitectura de referencia</w:t>
+      </w:r>
+    </w:p>
+    <w:p>
       <w:pPr>
         <w:jc w:val="center"/>
       </w:pPr>
       <w:r>
         <w:drawing>
           <wp:inline xmlns:a="http://schemas.openxmlformats.org/drawingml/2006/main" xmlns:pic="http://schemas.openxmlformats.org/drawingml/2006/picture">
-            <wp:extent cx="6120000" cy="3389538"/>
+            <wp:extent cx="6192000" cy="3302400"/>
             <wp:docPr id="2" name="Picture 2"/>
             <wp:cNvGraphicFramePr>
               <a:graphicFrameLocks noChangeAspect="1"/>
@@ -483,7 +499,7 @@
                   <pic:spPr>
                     <a:xfrm>
                       <a:off x="0" y="0"/>
-                      <a:ext cx="6120000" cy="3389538"/>
+                      <a:ext cx="6192000" cy="3302400"/>
                     </a:xfrm>
                     <a:prstGeom prst="rect"/>
                   </pic:spPr>
@@ -503,7 +519,7 @@
           <w:i/>
           <w:sz w:val="18"/>
         </w:rPr>
-        <w:t>Figura 1. Diagrama de referencia del escenario.</w:t>
+        <w:t>Figura 1. Arquitectura de referencia de la finca de cacao.</w:t>
       </w:r>
     </w:p>
     <w:p>
@@ -511,7 +527,151 @@
         <w:rPr>
           <w:b w:val="0"/>
         </w:rPr>
-        <w:t>Cada dispositivo se registra con DPS usando una clave derivada de una clave de grupo de inscripción (HMAC-SHA256 del identificador del dispositivo). DPS lo asigna al IoT Hub de la aplicación y desde ahí envía telemetría y propiedades. Los orígenes usan protocolos distintos: MQTT sobre TLS (8883), MQTT sobre WebSockets (443) y HTTPS.</w:t>
+        <w:t>La arquitectura incluye los dispositivos de la finca, que se comunican por Wi-Fi inalámbrico o por Ethernet según su ubicación; los datos pasan por un gateway (el módem 4G/LTE de la caseta) y salen a Internet. Los dos nodos que consumen APIs públicas salen directo a Internet, sin pasar por el módem de campo.</w:t>
+      </w:r>
+    </w:p>
+    <w:p>
+      <w:r>
+        <w:rPr>
+          <w:b w:val="0"/>
+        </w:rPr>
+        <w:t>Mediante la conexión a Internet los datos llegan a Azure IoT Central, donde el servicio de aprovisionamiento (DPS) asigna cada dispositivo al IoT Hub. Desde ahí los datos siguen la ruta caliente, tibia y fría descrita en la arquitectura del servicio, sobre una capa de servicios PaaS que aporta disponibilidad, escalabilidad y recuperación ante desastres. En la experiencia web de administración se gestionan los dispositivos (datos sin procesar, estado de conectividad, modelado y trabajos), se visualizan y analizan los datos (paneles, analítica y reglas) y se administran los usuarios y las organizaciones.</w:t>
+      </w:r>
+    </w:p>
+    <w:p>
+      <w:r>
+        <w:rPr>
+          <w:b w:val="0"/>
+        </w:rPr>
+        <w:t>En la integración empresarial, Azure Maps (Atlas Weather) se consulta para la calidad del aire del nodo 07 y las reglas de alerta envían correos electrónicos.</w:t>
+      </w:r>
+    </w:p>
+    <w:p>
+      <w:pPr>
+        <w:pStyle w:val="Heading2"/>
+      </w:pPr>
+      <w:r>
+        <w:t>Sensores y dispositivos</w:t>
+      </w:r>
+    </w:p>
+    <w:p>
+      <w:r>
+        <w:rPr>
+          <w:b w:val="0"/>
+        </w:rPr>
+        <w:t>Teniendo en cuenta el diseño de la finca, se tienen 10 dispositivos:</w:t>
+      </w:r>
+    </w:p>
+    <w:p>
+      <w:pPr>
+        <w:pStyle w:val="ListBullet"/>
+      </w:pPr>
+      <w:r>
+        <w:t>3 lotes de cultivo con sensores de humedad y temperatura de suelo, conductividad e iluminancia.</w:t>
+      </w:r>
+    </w:p>
+    <w:p>
+      <w:pPr>
+        <w:pStyle w:val="ListBullet"/>
+      </w:pPr>
+      <w:r>
+        <w:t>1 nodo de dosel de sombra con temperatura, humedad relativa e iluminancia.</w:t>
+      </w:r>
+    </w:p>
+    <w:p>
+      <w:pPr>
+        <w:pStyle w:val="ListBullet"/>
+      </w:pPr>
+      <w:r>
+        <w:t>1 estación de campo con pluviómetro y humedad foliar.</w:t>
+      </w:r>
+    </w:p>
+    <w:p>
+      <w:pPr>
+        <w:pStyle w:val="ListBullet"/>
+      </w:pPr>
+      <w:r>
+        <w:t>1 nodo de meteorología del predio y 1 nodo de calidad de aire, alimentados por APIs.</w:t>
+      </w:r>
+    </w:p>
+    <w:p>
+      <w:pPr>
+        <w:pStyle w:val="ListBullet"/>
+      </w:pPr>
+      <w:r>
+        <w:t>1 caja de secado y fermentación con temperatura, humedad y masa.</w:t>
+      </w:r>
+    </w:p>
+    <w:p>
+      <w:pPr>
+        <w:pStyle w:val="ListBullet"/>
+      </w:pPr>
+      <w:r>
+        <w:t>1 reservorio de riego con nivel de tanque, caudal y bomba.</w:t>
+      </w:r>
+    </w:p>
+    <w:p>
+      <w:pPr>
+        <w:pStyle w:val="ListBullet"/>
+      </w:pPr>
+      <w:r>
+        <w:t>1 nodo de perímetro y bodega con puerta, movimiento y temperatura.</w:t>
+      </w:r>
+    </w:p>
+    <w:p>
+      <w:r>
+        <w:rPr>
+          <w:b w:val="0"/>
+        </w:rPr>
+        <w:t>En la sección de plantillas se describe el resumen del DTDL de los dispositivos con sus variables.</w:t>
+      </w:r>
+    </w:p>
+    <w:p>
+      <w:pPr>
+        <w:pStyle w:val="Heading2"/>
+      </w:pPr>
+      <w:r>
+        <w:t>Comunicación</w:t>
+      </w:r>
+    </w:p>
+    <w:p>
+      <w:r>
+        <w:rPr>
+          <w:b w:val="0"/>
+        </w:rPr>
+        <w:t>Cada grupo de dispositivos tiene un tipo de conexión distinto:</w:t>
+      </w:r>
+    </w:p>
+    <w:p>
+      <w:pPr>
+        <w:pStyle w:val="ListBullet"/>
+      </w:pPr>
+      <w:r>
+        <w:t>Los nodos de campo (lotes, dosel, estación y reservorio) se conectan por Wi-Fi al módem 4G/LTE de la caseta, porque están dispersos en el predio y no se puede tender cable hasta cada uno.</w:t>
+      </w:r>
+    </w:p>
+    <w:p>
+      <w:pPr>
+        <w:pStyle w:val="ListBullet"/>
+      </w:pPr>
+      <w:r>
+        <w:t>La caja de secado y el nodo de la bodega van por Ethernet, porque están fijos dentro de la caseta y la bodega.</w:t>
+      </w:r>
+    </w:p>
+    <w:p>
+      <w:pPr>
+        <w:pStyle w:val="ListBullet"/>
+      </w:pPr>
+      <w:r>
+        <w:t>Los nodos de meteorología y calidad de aire no son sensores del predio: consultan APIs públicas y llegan por Internet directo, desde un equipo con salida propia.</w:t>
+      </w:r>
+    </w:p>
+    <w:p>
+      <w:pPr>
+        <w:pStyle w:val="ListBullet"/>
+      </w:pPr>
+      <w:r>
+        <w:t>Cada dispositivo se registra con DPS usando una clave derivada de la clave de grupo de inscripción (HMAC-SHA256 del identificador). Los orígenes usan protocolos distintos: MQTT sobre TLS (8883), MQTT sobre WebSockets (443) y HTTPS.</w:t>
       </w:r>
     </w:p>
     <w:p>
@@ -3405,14 +3565,18 @@
         <w:tblLook w:firstColumn="1" w:firstRow="1" w:lastColumn="0" w:lastRow="0" w:noHBand="0" w:noVBand="1" w:val="04A0"/>
       </w:tblPr>
       <w:tblGrid>
-        <w:gridCol w:w="3249"/>
-        <w:gridCol w:w="3249"/>
-        <w:gridCol w:w="3249"/>
+        <w:gridCol w:w="1392"/>
+        <w:gridCol w:w="1392"/>
+        <w:gridCol w:w="1392"/>
+        <w:gridCol w:w="1392"/>
+        <w:gridCol w:w="1392"/>
+        <w:gridCol w:w="1392"/>
+        <w:gridCol w:w="1392"/>
       </w:tblGrid>
       <w:tr>
         <w:tc>
           <w:tcPr>
-            <w:tcW w:type="dxa" w:w="3249"/>
+            <w:tcW w:type="dxa" w:w="1392"/>
             <w:shd w:val="clear" w:color="auto" w:fill="2F6F4E"/>
           </w:tcPr>
           <w:p>
@@ -3429,7 +3593,7 @@
         </w:tc>
         <w:tc>
           <w:tcPr>
-            <w:tcW w:type="dxa" w:w="3249"/>
+            <w:tcW w:type="dxa" w:w="1392"/>
             <w:shd w:val="clear" w:color="auto" w:fill="2F6F4E"/>
           </w:tcPr>
           <w:p>
@@ -3446,7 +3610,7 @@
         </w:tc>
         <w:tc>
           <w:tcPr>
-            <w:tcW w:type="dxa" w:w="3249"/>
+            <w:tcW w:type="dxa" w:w="1392"/>
             <w:shd w:val="clear" w:color="auto" w:fill="2F6F4E"/>
           </w:tcPr>
           <w:p>
@@ -3461,11 +3625,79 @@
             </w:r>
           </w:p>
         </w:tc>
+        <w:tc>
+          <w:tcPr>
+            <w:tcW w:type="dxa" w:w="1392"/>
+            <w:shd w:val="clear" w:color="auto" w:fill="2F6F4E"/>
+          </w:tcPr>
+          <w:p>
+            <w:r/>
+            <w:r>
+              <w:rPr>
+                <w:b/>
+                <w:color w:val="FFFFFF"/>
+                <w:sz w:val="19"/>
+              </w:rPr>
+              <w:t>24/09</w:t>
+            </w:r>
+          </w:p>
+        </w:tc>
+        <w:tc>
+          <w:tcPr>
+            <w:tcW w:type="dxa" w:w="1392"/>
+            <w:shd w:val="clear" w:color="auto" w:fill="2F6F4E"/>
+          </w:tcPr>
+          <w:p>
+            <w:r/>
+            <w:r>
+              <w:rPr>
+                <w:b/>
+                <w:color w:val="FFFFFF"/>
+                <w:sz w:val="19"/>
+              </w:rPr>
+              <w:t>25/09</w:t>
+            </w:r>
+          </w:p>
+        </w:tc>
+        <w:tc>
+          <w:tcPr>
+            <w:tcW w:type="dxa" w:w="1392"/>
+            <w:shd w:val="clear" w:color="auto" w:fill="2F6F4E"/>
+          </w:tcPr>
+          <w:p>
+            <w:r/>
+            <w:r>
+              <w:rPr>
+                <w:b/>
+                <w:color w:val="FFFFFF"/>
+                <w:sz w:val="19"/>
+              </w:rPr>
+              <w:t>26/09</w:t>
+            </w:r>
+          </w:p>
+        </w:tc>
+        <w:tc>
+          <w:tcPr>
+            <w:tcW w:type="dxa" w:w="1392"/>
+            <w:shd w:val="clear" w:color="auto" w:fill="2F6F4E"/>
+          </w:tcPr>
+          <w:p>
+            <w:r/>
+            <w:r>
+              <w:rPr>
+                <w:b/>
+                <w:color w:val="FFFFFF"/>
+                <w:sz w:val="19"/>
+              </w:rPr>
+              <w:t>27/09</w:t>
+            </w:r>
+          </w:p>
+        </w:tc>
       </w:tr>
       <w:tr>
         <w:tc>
           <w:tcPr>
-            <w:tcW w:type="dxa" w:w="3249"/>
+            <w:tcW w:type="dxa" w:w="1392"/>
           </w:tcPr>
           <w:p>
             <w:r/>
@@ -3479,7 +3711,7 @@
         </w:tc>
         <w:tc>
           <w:tcPr>
-            <w:tcW w:type="dxa" w:w="3249"/>
+            <w:tcW w:type="dxa" w:w="1392"/>
           </w:tcPr>
           <w:p>
             <w:r/>
@@ -3493,7 +3725,7 @@
         </w:tc>
         <w:tc>
           <w:tcPr>
-            <w:tcW w:type="dxa" w:w="3249"/>
+            <w:tcW w:type="dxa" w:w="1392"/>
           </w:tcPr>
           <w:p>
             <w:r/>
@@ -3505,11 +3737,67 @@
             </w:r>
           </w:p>
         </w:tc>
+        <w:tc>
+          <w:tcPr>
+            <w:tcW w:type="dxa" w:w="1392"/>
+          </w:tcPr>
+          <w:p>
+            <w:r/>
+            <w:r>
+              <w:rPr>
+                <w:sz w:val="19"/>
+              </w:rPr>
+              <w:t>24</w:t>
+            </w:r>
+          </w:p>
+        </w:tc>
+        <w:tc>
+          <w:tcPr>
+            <w:tcW w:type="dxa" w:w="1392"/>
+          </w:tcPr>
+          <w:p>
+            <w:r/>
+            <w:r>
+              <w:rPr>
+                <w:sz w:val="19"/>
+              </w:rPr>
+              <w:t>24</w:t>
+            </w:r>
+          </w:p>
+        </w:tc>
+        <w:tc>
+          <w:tcPr>
+            <w:tcW w:type="dxa" w:w="1392"/>
+          </w:tcPr>
+          <w:p>
+            <w:r/>
+            <w:r>
+              <w:rPr>
+                <w:sz w:val="19"/>
+              </w:rPr>
+              <w:t>24</w:t>
+            </w:r>
+          </w:p>
+        </w:tc>
+        <w:tc>
+          <w:tcPr>
+            <w:tcW w:type="dxa" w:w="1392"/>
+          </w:tcPr>
+          <w:p>
+            <w:r/>
+            <w:r>
+              <w:rPr>
+                <w:sz w:val="19"/>
+              </w:rPr>
+              <w:t>11</w:t>
+            </w:r>
+          </w:p>
+        </w:tc>
       </w:tr>
       <w:tr>
         <w:tc>
           <w:tcPr>
-            <w:tcW w:type="dxa" w:w="3249"/>
+            <w:tcW w:type="dxa" w:w="1392"/>
           </w:tcPr>
           <w:p>
             <w:r/>
@@ -3523,7 +3811,7 @@
         </w:tc>
         <w:tc>
           <w:tcPr>
-            <w:tcW w:type="dxa" w:w="3249"/>
+            <w:tcW w:type="dxa" w:w="1392"/>
           </w:tcPr>
           <w:p>
             <w:r/>
@@ -3537,7 +3825,7 @@
         </w:tc>
         <w:tc>
           <w:tcPr>
-            <w:tcW w:type="dxa" w:w="3249"/>
+            <w:tcW w:type="dxa" w:w="1392"/>
           </w:tcPr>
           <w:p>
             <w:r/>
@@ -3545,7 +3833,63 @@
               <w:rPr>
                 <w:sz w:val="19"/>
               </w:rPr>
-              <w:t>6</w:t>
+              <w:t>7</w:t>
+            </w:r>
+          </w:p>
+        </w:tc>
+        <w:tc>
+          <w:tcPr>
+            <w:tcW w:type="dxa" w:w="1392"/>
+          </w:tcPr>
+          <w:p>
+            <w:r/>
+            <w:r>
+              <w:rPr>
+                <w:sz w:val="19"/>
+              </w:rPr>
+              <w:t>24</w:t>
+            </w:r>
+          </w:p>
+        </w:tc>
+        <w:tc>
+          <w:tcPr>
+            <w:tcW w:type="dxa" w:w="1392"/>
+          </w:tcPr>
+          <w:p>
+            <w:r/>
+            <w:r>
+              <w:rPr>
+                <w:sz w:val="19"/>
+              </w:rPr>
+              <w:t>24</w:t>
+            </w:r>
+          </w:p>
+        </w:tc>
+        <w:tc>
+          <w:tcPr>
+            <w:tcW w:type="dxa" w:w="1392"/>
+          </w:tcPr>
+          <w:p>
+            <w:r/>
+            <w:r>
+              <w:rPr>
+                <w:sz w:val="19"/>
+              </w:rPr>
+              <w:t>24</w:t>
+            </w:r>
+          </w:p>
+        </w:tc>
+        <w:tc>
+          <w:tcPr>
+            <w:tcW w:type="dxa" w:w="1392"/>
+          </w:tcPr>
+          <w:p>
+            <w:r/>
+            <w:r>
+              <w:rPr>
+                <w:sz w:val="19"/>
+              </w:rPr>
+              <w:t>11</w:t>
             </w:r>
           </w:p>
         </w:tc>
@@ -3553,7 +3897,7 @@
       <w:tr>
         <w:tc>
           <w:tcPr>
-            <w:tcW w:type="dxa" w:w="3249"/>
+            <w:tcW w:type="dxa" w:w="1392"/>
           </w:tcPr>
           <w:p>
             <w:r/>
@@ -3567,7 +3911,7 @@
         </w:tc>
         <w:tc>
           <w:tcPr>
-            <w:tcW w:type="dxa" w:w="3249"/>
+            <w:tcW w:type="dxa" w:w="1392"/>
           </w:tcPr>
           <w:p>
             <w:r/>
@@ -3581,7 +3925,7 @@
         </w:tc>
         <w:tc>
           <w:tcPr>
-            <w:tcW w:type="dxa" w:w="3249"/>
+            <w:tcW w:type="dxa" w:w="1392"/>
           </w:tcPr>
           <w:p>
             <w:r/>
@@ -3593,11 +3937,67 @@
             </w:r>
           </w:p>
         </w:tc>
+        <w:tc>
+          <w:tcPr>
+            <w:tcW w:type="dxa" w:w="1392"/>
+          </w:tcPr>
+          <w:p>
+            <w:r/>
+            <w:r>
+              <w:rPr>
+                <w:sz w:val="19"/>
+              </w:rPr>
+              <w:t>24</w:t>
+            </w:r>
+          </w:p>
+        </w:tc>
+        <w:tc>
+          <w:tcPr>
+            <w:tcW w:type="dxa" w:w="1392"/>
+          </w:tcPr>
+          <w:p>
+            <w:r/>
+            <w:r>
+              <w:rPr>
+                <w:sz w:val="19"/>
+              </w:rPr>
+              <w:t>24</w:t>
+            </w:r>
+          </w:p>
+        </w:tc>
+        <w:tc>
+          <w:tcPr>
+            <w:tcW w:type="dxa" w:w="1392"/>
+          </w:tcPr>
+          <w:p>
+            <w:r/>
+            <w:r>
+              <w:rPr>
+                <w:sz w:val="19"/>
+              </w:rPr>
+              <w:t>24</w:t>
+            </w:r>
+          </w:p>
+        </w:tc>
+        <w:tc>
+          <w:tcPr>
+            <w:tcW w:type="dxa" w:w="1392"/>
+          </w:tcPr>
+          <w:p>
+            <w:r/>
+            <w:r>
+              <w:rPr>
+                <w:sz w:val="19"/>
+              </w:rPr>
+              <w:t>11</w:t>
+            </w:r>
+          </w:p>
+        </w:tc>
       </w:tr>
       <w:tr>
         <w:tc>
           <w:tcPr>
-            <w:tcW w:type="dxa" w:w="3249"/>
+            <w:tcW w:type="dxa" w:w="1392"/>
           </w:tcPr>
           <w:p>
             <w:r/>
@@ -3611,7 +4011,7 @@
         </w:tc>
         <w:tc>
           <w:tcPr>
-            <w:tcW w:type="dxa" w:w="3249"/>
+            <w:tcW w:type="dxa" w:w="1392"/>
           </w:tcPr>
           <w:p>
             <w:r/>
@@ -3625,7 +4025,21 @@
         </w:tc>
         <w:tc>
           <w:tcPr>
-            <w:tcW w:type="dxa" w:w="3249"/>
+            <w:tcW w:type="dxa" w:w="1392"/>
+          </w:tcPr>
+          <w:p>
+            <w:r/>
+            <w:r>
+              <w:rPr>
+                <w:sz w:val="19"/>
+              </w:rPr>
+              <w:t>19</w:t>
+            </w:r>
+          </w:p>
+        </w:tc>
+        <w:tc>
+          <w:tcPr>
+            <w:tcW w:type="dxa" w:w="1392"/>
           </w:tcPr>
           <w:p>
             <w:r/>
@@ -3637,11 +4051,53 @@
             </w:r>
           </w:p>
         </w:tc>
+        <w:tc>
+          <w:tcPr>
+            <w:tcW w:type="dxa" w:w="1392"/>
+          </w:tcPr>
+          <w:p>
+            <w:r/>
+            <w:r>
+              <w:rPr>
+                <w:sz w:val="19"/>
+              </w:rPr>
+              <w:t>24</w:t>
+            </w:r>
+          </w:p>
+        </w:tc>
+        <w:tc>
+          <w:tcPr>
+            <w:tcW w:type="dxa" w:w="1392"/>
+          </w:tcPr>
+          <w:p>
+            <w:r/>
+            <w:r>
+              <w:rPr>
+                <w:sz w:val="19"/>
+              </w:rPr>
+              <w:t>19</w:t>
+            </w:r>
+          </w:p>
+        </w:tc>
+        <w:tc>
+          <w:tcPr>
+            <w:tcW w:type="dxa" w:w="1392"/>
+          </w:tcPr>
+          <w:p>
+            <w:r/>
+            <w:r>
+              <w:rPr>
+                <w:sz w:val="19"/>
+              </w:rPr>
+              <w:t>11</w:t>
+            </w:r>
+          </w:p>
+        </w:tc>
       </w:tr>
       <w:tr>
         <w:tc>
           <w:tcPr>
-            <w:tcW w:type="dxa" w:w="3249"/>
+            <w:tcW w:type="dxa" w:w="1392"/>
           </w:tcPr>
           <w:p>
             <w:r/>
@@ -3655,7 +4111,7 @@
         </w:tc>
         <w:tc>
           <w:tcPr>
-            <w:tcW w:type="dxa" w:w="3249"/>
+            <w:tcW w:type="dxa" w:w="1392"/>
           </w:tcPr>
           <w:p>
             <w:r/>
@@ -3669,7 +4125,7 @@
         </w:tc>
         <w:tc>
           <w:tcPr>
-            <w:tcW w:type="dxa" w:w="3249"/>
+            <w:tcW w:type="dxa" w:w="1392"/>
           </w:tcPr>
           <w:p>
             <w:r/>
@@ -3677,7 +4133,63 @@
               <w:rPr>
                 <w:sz w:val="19"/>
               </w:rPr>
-              <w:t>13</w:t>
+              <w:t>10</w:t>
+            </w:r>
+          </w:p>
+        </w:tc>
+        <w:tc>
+          <w:tcPr>
+            <w:tcW w:type="dxa" w:w="1392"/>
+          </w:tcPr>
+          <w:p>
+            <w:r/>
+            <w:r>
+              <w:rPr>
+                <w:sz w:val="19"/>
+              </w:rPr>
+              <w:t>24</w:t>
+            </w:r>
+          </w:p>
+        </w:tc>
+        <w:tc>
+          <w:tcPr>
+            <w:tcW w:type="dxa" w:w="1392"/>
+          </w:tcPr>
+          <w:p>
+            <w:r/>
+            <w:r>
+              <w:rPr>
+                <w:sz w:val="19"/>
+              </w:rPr>
+              <w:t>24</w:t>
+            </w:r>
+          </w:p>
+        </w:tc>
+        <w:tc>
+          <w:tcPr>
+            <w:tcW w:type="dxa" w:w="1392"/>
+          </w:tcPr>
+          <w:p>
+            <w:r/>
+            <w:r>
+              <w:rPr>
+                <w:sz w:val="19"/>
+              </w:rPr>
+              <w:t>19</w:t>
+            </w:r>
+          </w:p>
+        </w:tc>
+        <w:tc>
+          <w:tcPr>
+            <w:tcW w:type="dxa" w:w="1392"/>
+          </w:tcPr>
+          <w:p>
+            <w:r/>
+            <w:r>
+              <w:rPr>
+                <w:sz w:val="19"/>
+              </w:rPr>
+              <w:t>11</w:t>
             </w:r>
           </w:p>
         </w:tc>
@@ -3685,7 +4197,7 @@
       <w:tr>
         <w:tc>
           <w:tcPr>
-            <w:tcW w:type="dxa" w:w="3249"/>
+            <w:tcW w:type="dxa" w:w="1392"/>
           </w:tcPr>
           <w:p>
             <w:r/>
@@ -3699,7 +4211,7 @@
         </w:tc>
         <w:tc>
           <w:tcPr>
-            <w:tcW w:type="dxa" w:w="3249"/>
+            <w:tcW w:type="dxa" w:w="1392"/>
           </w:tcPr>
           <w:p>
             <w:r/>
@@ -3713,7 +4225,7 @@
         </w:tc>
         <w:tc>
           <w:tcPr>
-            <w:tcW w:type="dxa" w:w="3249"/>
+            <w:tcW w:type="dxa" w:w="1392"/>
           </w:tcPr>
           <w:p>
             <w:r/>
@@ -3725,11 +4237,67 @@
             </w:r>
           </w:p>
         </w:tc>
+        <w:tc>
+          <w:tcPr>
+            <w:tcW w:type="dxa" w:w="1392"/>
+          </w:tcPr>
+          <w:p>
+            <w:r/>
+            <w:r>
+              <w:rPr>
+                <w:sz w:val="19"/>
+              </w:rPr>
+              <w:t>24</w:t>
+            </w:r>
+          </w:p>
+        </w:tc>
+        <w:tc>
+          <w:tcPr>
+            <w:tcW w:type="dxa" w:w="1392"/>
+          </w:tcPr>
+          <w:p>
+            <w:r/>
+            <w:r>
+              <w:rPr>
+                <w:sz w:val="19"/>
+              </w:rPr>
+              <w:t>24</w:t>
+            </w:r>
+          </w:p>
+        </w:tc>
+        <w:tc>
+          <w:tcPr>
+            <w:tcW w:type="dxa" w:w="1392"/>
+          </w:tcPr>
+          <w:p>
+            <w:r/>
+            <w:r>
+              <w:rPr>
+                <w:sz w:val="19"/>
+              </w:rPr>
+              <w:t>24</w:t>
+            </w:r>
+          </w:p>
+        </w:tc>
+        <w:tc>
+          <w:tcPr>
+            <w:tcW w:type="dxa" w:w="1392"/>
+          </w:tcPr>
+          <w:p>
+            <w:r/>
+            <w:r>
+              <w:rPr>
+                <w:sz w:val="19"/>
+              </w:rPr>
+              <w:t>11</w:t>
+            </w:r>
+          </w:p>
+        </w:tc>
       </w:tr>
       <w:tr>
         <w:tc>
           <w:tcPr>
-            <w:tcW w:type="dxa" w:w="3249"/>
+            <w:tcW w:type="dxa" w:w="1392"/>
           </w:tcPr>
           <w:p>
             <w:r/>
@@ -3743,7 +4311,7 @@
         </w:tc>
         <w:tc>
           <w:tcPr>
-            <w:tcW w:type="dxa" w:w="3249"/>
+            <w:tcW w:type="dxa" w:w="1392"/>
           </w:tcPr>
           <w:p>
             <w:r/>
@@ -3757,7 +4325,7 @@
         </w:tc>
         <w:tc>
           <w:tcPr>
-            <w:tcW w:type="dxa" w:w="3249"/>
+            <w:tcW w:type="dxa" w:w="1392"/>
           </w:tcPr>
           <w:p>
             <w:r/>
@@ -3769,11 +4337,67 @@
             </w:r>
           </w:p>
         </w:tc>
+        <w:tc>
+          <w:tcPr>
+            <w:tcW w:type="dxa" w:w="1392"/>
+          </w:tcPr>
+          <w:p>
+            <w:r/>
+            <w:r>
+              <w:rPr>
+                <w:sz w:val="19"/>
+              </w:rPr>
+              <w:t>24</w:t>
+            </w:r>
+          </w:p>
+        </w:tc>
+        <w:tc>
+          <w:tcPr>
+            <w:tcW w:type="dxa" w:w="1392"/>
+          </w:tcPr>
+          <w:p>
+            <w:r/>
+            <w:r>
+              <w:rPr>
+                <w:sz w:val="19"/>
+              </w:rPr>
+              <w:t>24</w:t>
+            </w:r>
+          </w:p>
+        </w:tc>
+        <w:tc>
+          <w:tcPr>
+            <w:tcW w:type="dxa" w:w="1392"/>
+          </w:tcPr>
+          <w:p>
+            <w:r/>
+            <w:r>
+              <w:rPr>
+                <w:sz w:val="19"/>
+              </w:rPr>
+              <w:t>24</w:t>
+            </w:r>
+          </w:p>
+        </w:tc>
+        <w:tc>
+          <w:tcPr>
+            <w:tcW w:type="dxa" w:w="1392"/>
+          </w:tcPr>
+          <w:p>
+            <w:r/>
+            <w:r>
+              <w:rPr>
+                <w:sz w:val="19"/>
+              </w:rPr>
+              <w:t>11</w:t>
+            </w:r>
+          </w:p>
+        </w:tc>
       </w:tr>
       <w:tr>
         <w:tc>
           <w:tcPr>
-            <w:tcW w:type="dxa" w:w="3249"/>
+            <w:tcW w:type="dxa" w:w="1392"/>
           </w:tcPr>
           <w:p>
             <w:r/>
@@ -3787,7 +4411,7 @@
         </w:tc>
         <w:tc>
           <w:tcPr>
-            <w:tcW w:type="dxa" w:w="3249"/>
+            <w:tcW w:type="dxa" w:w="1392"/>
           </w:tcPr>
           <w:p>
             <w:r/>
@@ -3801,7 +4425,7 @@
         </w:tc>
         <w:tc>
           <w:tcPr>
-            <w:tcW w:type="dxa" w:w="3249"/>
+            <w:tcW w:type="dxa" w:w="1392"/>
           </w:tcPr>
           <w:p>
             <w:r/>
@@ -3813,6 +4437,62 @@
             </w:r>
           </w:p>
         </w:tc>
+        <w:tc>
+          <w:tcPr>
+            <w:tcW w:type="dxa" w:w="1392"/>
+          </w:tcPr>
+          <w:p>
+            <w:r/>
+            <w:r>
+              <w:rPr>
+                <w:sz w:val="19"/>
+              </w:rPr>
+              <w:t>24</w:t>
+            </w:r>
+          </w:p>
+        </w:tc>
+        <w:tc>
+          <w:tcPr>
+            <w:tcW w:type="dxa" w:w="1392"/>
+          </w:tcPr>
+          <w:p>
+            <w:r/>
+            <w:r>
+              <w:rPr>
+                <w:sz w:val="19"/>
+              </w:rPr>
+              <w:t>24</w:t>
+            </w:r>
+          </w:p>
+        </w:tc>
+        <w:tc>
+          <w:tcPr>
+            <w:tcW w:type="dxa" w:w="1392"/>
+          </w:tcPr>
+          <w:p>
+            <w:r/>
+            <w:r>
+              <w:rPr>
+                <w:sz w:val="19"/>
+              </w:rPr>
+              <w:t>24</w:t>
+            </w:r>
+          </w:p>
+        </w:tc>
+        <w:tc>
+          <w:tcPr>
+            <w:tcW w:type="dxa" w:w="1392"/>
+          </w:tcPr>
+          <w:p>
+            <w:r/>
+            <w:r>
+              <w:rPr>
+                <w:sz w:val="19"/>
+              </w:rPr>
+              <w:t>11</w:t>
+            </w:r>
+          </w:p>
+        </w:tc>
       </w:tr>
     </w:tbl>
     <w:p/>
@@ -3821,7 +4501,7 @@
         <w:rPr>
           <w:b w:val="0"/>
         </w:rPr>
-        <w:t>Los días 24 y 25 de septiembre se completan cuando termine la captura.</w:t>
+        <w:t>La flota quedó registrando datos durante 6 días no continuos entre el 22/09 y el 27/09 de septiembre, más de los 4 días que pide el enunciado. En cada día se ven horas sin datos porque cada dispositivo sigue su propio ciclo de apagón simulado.</w:t>
       </w:r>
     </w:p>
     <w:p>
@@ -3884,6 +4564,14 @@
       </w:r>
     </w:p>
     <w:p>
+      <w:r>
+        <w:rPr>
+          <w:b w:val="0"/>
+        </w:rPr>
+        <w:t>La humedad de suelo tiene un patron de diente de sierra: baja poco a poco por la evapotranspiracion y sube de golpe cuando el simulador marca un riego. El lote 1 usa el simulador nativo de IoT Central, que genera numeros aleatorios en todo el rango de la variable, por eso se mueve mas brusco que el lote 3, que corre el script propio con limites realistas. Lote de cultivo 1: se movio entre 1.6 y 99.7, con un promedio de 50.0. El valor mas alto se dio el 27/09 a las 02:36 y el mas bajo el 27/09 a las 07:59. Lote de cultivo 3: se movio entre 22.0 y 42.3, con un promedio de 25.7. El valor mas alto se dio el 23/09 a las 22:45 y el mas bajo el 23/09 a las 14:27.</w:t>
+      </w:r>
+    </w:p>
+    <w:p>
       <w:pPr>
         <w:jc w:val="center"/>
       </w:pPr>
@@ -3932,6 +4620,14 @@
           <w:sz w:val="18"/>
         </w:rPr>
         <w:t>Figura 3. Temperatura del suelo.</w:t>
+      </w:r>
+    </w:p>
+    <w:p>
+      <w:r>
+        <w:rPr>
+          <w:b w:val="0"/>
+        </w:rPr>
+        <w:t>Esta variable solo la envian el lote 1 (simulador nativo) y el lote 2, que todavia esta pendiente de conectar por Wokwi; por eso la grafica muestra un solo dispositivo. Lote de cultivo 1: se movio entre 1.7 y 99.0, con un promedio de 50.0. El valor mas alto se dio el 27/09 a las 01:01 y el mas bajo el 22/09 a las 21:33.</w:t>
       </w:r>
     </w:p>
     <w:p>
@@ -3986,6 +4682,14 @@
       </w:r>
     </w:p>
     <w:p>
+      <w:r>
+        <w:rPr>
+          <w:b w:val="0"/>
+        </w:rPr>
+        <w:t>Bajo el dosel de sombra la temperatura y la humedad se mueven al contrario: cuando una sube la otra baja, porque las dos dependen de la misma hora del dia. Dosel de sombra: se movio entre 21.1 y 28.9, con un promedio de 24.9. El valor mas alto se dio el 25/09 a las 13:37 y el mas bajo el 27/09 a las 01:50. En cuanto a la humedad relativa, se movio entre 66.5 y 93.5, con un promedio de 80.4. El valor mas alto se dio el 24/09 a las 02:08 y el mas bajo el 26/09 a las 13:56.</w:t>
+      </w:r>
+    </w:p>
+    <w:p>
       <w:pPr>
         <w:jc w:val="center"/>
       </w:pPr>
@@ -4034,6 +4738,14 @@
           <w:sz w:val="18"/>
         </w:rPr>
         <w:t>Figura 5. Temperatura de la API Open-Meteo.</w:t>
+      </w:r>
+    </w:p>
+    <w:p>
+      <w:r>
+        <w:rPr>
+          <w:b w:val="0"/>
+        </w:rPr>
+        <w:t>Estos datos vienen directo de la API de Open-Meteo, sin simular nada. Meteorologia del predio: se movio entre 21.2 y 29.9, con un promedio de 24.5. El valor mas alto se dio el 23/09 a las 13:45 y el mas bajo el 24/09 a las 04:47. En total llovio 74.2 mm durante la ventana capturada, con lluvia registrada el 27/09, 26/09, 25/09, 24/09, 23/09.</w:t>
       </w:r>
     </w:p>
     <w:p>
@@ -4088,6 +4800,14 @@
       </w:r>
     </w:p>
     <w:p>
+      <w:r>
+        <w:rPr>
+          <w:b w:val="0"/>
+        </w:rPr>
+        <w:t>El PM2.5 y el indice de calidad del aire salen de Azure Maps Weather (Atlas Weather) para la ubicacion del predio. Calidad de aire: se movio entre 7.7 y 24.2, con un promedio de 13.9. El valor mas alto se dio el 25/09 a las 08:42 y el mas bajo el 26/09 a las 07:47. El indice de calidad de aire (AQI) llego a un maximo de 81 en la ventana capturada.</w:t>
+      </w:r>
+    </w:p>
+    <w:p>
       <w:pPr>
         <w:jc w:val="center"/>
       </w:pPr>
@@ -4136,6 +4856,14 @@
           <w:sz w:val="18"/>
         </w:rPr>
         <w:t>Figura 7. Temperatura de la caja de fermentación.</w:t>
+      </w:r>
+    </w:p>
+    <w:p>
+      <w:r>
+        <w:rPr>
+          <w:b w:val="0"/>
+        </w:rPr>
+        <w:t>La temperatura de la caja de fermentacion sube poco a poco a medida que pasan los dias del proceso: empezo en 30.5 el 23/09 y llego a 34.2 el 27/09, con un maximo de 38.0. Esto es porque el script simula el avance de la fermentacion, que se calienta con los dias.</w:t>
       </w:r>
     </w:p>
     <w:p>
@@ -4190,6 +4918,14 @@
       </w:r>
     </w:p>
     <w:p>
+      <w:r>
+        <w:rPr>
+          <w:b w:val="0"/>
+        </w:rPr>
+        <w:t>Perimetro y bodega: se movio entre 22.7 y 29.8, con un promedio de 26.2. El valor mas alto se dio el 23/09 a las 13:57 y el mas bajo el 24/09 a las 01:41. Ademas se registraron 199 lecturas con la puerta abierta y 313 con movimiento detectado, que son los eventos que revisan las reglas de seguridad de la bodega.</w:t>
+      </w:r>
+    </w:p>
+    <w:p>
       <w:pPr>
         <w:jc w:val="center"/>
       </w:pPr>
@@ -4241,6 +4977,14 @@
       </w:r>
     </w:p>
     <w:p>
+      <w:r>
+        <w:rPr>
+          <w:b w:val="0"/>
+        </w:rPr>
+        <w:t>La humedad foliar sube cuando el script simula lluvia en la tarde y baja el resto del dia. Estacion de campo: se movio entre 5.0 y 99.9, con un promedio de 30.8. El valor mas alto se dio el 26/09 a las 14:25 y el mas bajo el 23/09 a las 23:30. La lluvia acumulada del lote en la ventana capturada fue de 44.8 mm.</w:t>
+      </w:r>
+    </w:p>
+    <w:p>
       <w:pPr>
         <w:pStyle w:val="Heading1"/>
       </w:pPr>
@@ -4253,7 +4997,7 @@
         <w:rPr>
           <w:b w:val="0"/>
         </w:rPr>
-        <w:t>El repositorio contiene el README, los modelos DTDL (modelo), los scripts de cada origen (scripts), los proyectos de Wokwi (wokwi), los datos exportados (datos) y las evidencias. Las claves y el ID scope no se suben: se leen de variables de entorno y de archivos secrets.h locales, que están en el .gitignore.</w:t>
+        <w:t>El repositorio está en github.com/Rafaariasxd/parcial1-iot-central-cacao y contiene el README, los modelos DTDL (modelo), los scripts de cada origen (scripts), los proyectos de Wokwi (wokwi), los datos exportados (datos) y las evidencias. Las claves y el ID scope no se suben: se leen de variables de entorno y de archivos secrets.h locales, que están en el .gitignore.</w:t>
       </w:r>
     </w:p>
     <w:p>

</xml_diff>

<commit_message>
Plano pixel-art de la finca, iconos por plantilla y se quita sustentacion
</commit_message>
<xml_diff>
--- a/documento/Parcial1_IoT_Central.docx
+++ b/documento/Parcial1_IoT_Central.docx
@@ -452,7 +452,82 @@
         <w:pStyle w:val="Heading1"/>
       </w:pPr>
       <w:r>
-        <w:t>2. Arquitectura de referencia</w:t>
+        <w:t>2. Plano de la finca</w:t>
+      </w:r>
+    </w:p>
+    <w:p>
+      <w:r>
+        <w:rPr>
+          <w:b w:val="0"/>
+        </w:rPr>
+        <w:t>El predio se organiza en cuatro zonas: los tres lotes de cultivo al occidente, el dosel de sombra y la estación de campo en el cruce de los caminos internos, la caseta central con el módem 4G/LTE y el reservorio de riego, y la bodega de secado y fermentación. El plano ubica los 10 dispositivos sobre esas zonas.</w:t>
+      </w:r>
+    </w:p>
+    <w:p>
+      <w:pPr>
+        <w:jc w:val="center"/>
+      </w:pPr>
+      <w:r>
+        <w:drawing>
+          <wp:inline xmlns:a="http://schemas.openxmlformats.org/drawingml/2006/main" xmlns:pic="http://schemas.openxmlformats.org/drawingml/2006/picture">
+            <wp:extent cx="5760000" cy="4189091"/>
+            <wp:docPr id="2" name="Picture 2"/>
+            <wp:cNvGraphicFramePr>
+              <a:graphicFrameLocks noChangeAspect="1"/>
+            </wp:cNvGraphicFramePr>
+            <a:graphic>
+              <a:graphicData uri="http://schemas.openxmlformats.org/drawingml/2006/picture">
+                <pic:pic>
+                  <pic:nvPicPr>
+                    <pic:cNvPr id="0" name="plano_finca.png"/>
+                    <pic:cNvPicPr/>
+                  </pic:nvPicPr>
+                  <pic:blipFill>
+                    <a:blip r:embed="rId10"/>
+                    <a:stretch>
+                      <a:fillRect/>
+                    </a:stretch>
+                  </pic:blipFill>
+                  <pic:spPr>
+                    <a:xfrm>
+                      <a:off x="0" y="0"/>
+                      <a:ext cx="5760000" cy="4189091"/>
+                    </a:xfrm>
+                    <a:prstGeom prst="rect"/>
+                  </pic:spPr>
+                </pic:pic>
+              </a:graphicData>
+            </a:graphic>
+          </wp:inline>
+        </w:drawing>
+      </w:r>
+    </w:p>
+    <w:p>
+      <w:pPr>
+        <w:jc w:val="center"/>
+      </w:pPr>
+      <w:r>
+        <w:rPr>
+          <w:i/>
+          <w:sz w:val="18"/>
+        </w:rPr>
+        <w:t>Figura 1. Plano de la finca con la ubicación de los 10 dispositivos.</w:t>
+      </w:r>
+    </w:p>
+    <w:p>
+      <w:r>
+        <w:rPr>
+          <w:b w:val="0"/>
+        </w:rPr>
+        <w:t>1 lote-cultivo-01, 2 lote-cultivo-02, 3 lote-cultivo-03, 4 dosel-sombra-01, 5 estacion-campo-01, 6 meteorologia-predio-01, 7 calidad-aire-01, 8 secado-fermentacion-01, 9 reservorio-riego-01, 10 perimetro-bodega-01.</w:t>
+      </w:r>
+    </w:p>
+    <w:p>
+      <w:pPr>
+        <w:pStyle w:val="Heading1"/>
+      </w:pPr>
+      <w:r>
+        <w:t>3. Arquitectura de referencia</w:t>
       </w:r>
     </w:p>
     <w:p>
@@ -479,7 +554,7 @@
         <w:drawing>
           <wp:inline xmlns:a="http://schemas.openxmlformats.org/drawingml/2006/main" xmlns:pic="http://schemas.openxmlformats.org/drawingml/2006/picture">
             <wp:extent cx="6192000" cy="3302400"/>
-            <wp:docPr id="2" name="Picture 2"/>
+            <wp:docPr id="3" name="Picture 3"/>
             <wp:cNvGraphicFramePr>
               <a:graphicFrameLocks noChangeAspect="1"/>
             </wp:cNvGraphicFramePr>
@@ -491,7 +566,7 @@
                     <pic:cNvPicPr/>
                   </pic:nvPicPr>
                   <pic:blipFill>
-                    <a:blip r:embed="rId10"/>
+                    <a:blip r:embed="rId11"/>
                     <a:stretch>
                       <a:fillRect/>
                     </a:stretch>
@@ -519,7 +594,7 @@
           <w:i/>
           <w:sz w:val="18"/>
         </w:rPr>
-        <w:t>Figura 1. Arquitectura de referencia de la finca de cacao.</w:t>
+        <w:t>Figura 2. Arquitectura de referencia de la finca de cacao.</w:t>
       </w:r>
     </w:p>
     <w:p>
@@ -679,7 +754,58 @@
         <w:pStyle w:val="Heading1"/>
       </w:pPr>
       <w:r>
-        <w:t>3. Catálogo de dispositivos y orígenes</w:t>
+        <w:t>4. Catálogo de dispositivos y orígenes</w:t>
+      </w:r>
+    </w:p>
+    <w:p>
+      <w:pPr>
+        <w:jc w:val="center"/>
+      </w:pPr>
+      <w:r>
+        <w:drawing>
+          <wp:inline xmlns:a="http://schemas.openxmlformats.org/drawingml/2006/main" xmlns:pic="http://schemas.openxmlformats.org/drawingml/2006/picture">
+            <wp:extent cx="5940000" cy="904097"/>
+            <wp:docPr id="4" name="Picture 4"/>
+            <wp:cNvGraphicFramePr>
+              <a:graphicFrameLocks noChangeAspect="1"/>
+            </wp:cNvGraphicFramePr>
+            <a:graphic>
+              <a:graphicData uri="http://schemas.openxmlformats.org/drawingml/2006/picture">
+                <pic:pic>
+                  <pic:nvPicPr>
+                    <pic:cNvPr id="0" name="iconos_dispositivos.png"/>
+                    <pic:cNvPicPr/>
+                  </pic:nvPicPr>
+                  <pic:blipFill>
+                    <a:blip r:embed="rId12"/>
+                    <a:stretch>
+                      <a:fillRect/>
+                    </a:stretch>
+                  </pic:blipFill>
+                  <pic:spPr>
+                    <a:xfrm>
+                      <a:off x="0" y="0"/>
+                      <a:ext cx="5940000" cy="904097"/>
+                    </a:xfrm>
+                    <a:prstGeom prst="rect"/>
+                  </pic:spPr>
+                </pic:pic>
+              </a:graphicData>
+            </a:graphic>
+          </wp:inline>
+        </w:drawing>
+      </w:r>
+    </w:p>
+    <w:p>
+      <w:pPr>
+        <w:jc w:val="center"/>
+      </w:pPr>
+      <w:r>
+        <w:rPr>
+          <w:i/>
+          <w:sz w:val="18"/>
+        </w:rPr>
+        <w:t>Figura 3. Un ícono por cada plantilla de dispositivo.</w:t>
       </w:r>
     </w:p>
     <w:tbl>
@@ -1510,7 +1636,7 @@
         <w:pStyle w:val="Heading1"/>
       </w:pPr>
       <w:r>
-        <w:t>4. Parámetros y hojas de datos de referencia</w:t>
+        <w:t>5. Parámetros y hojas de datos de referencia</w:t>
       </w:r>
     </w:p>
     <w:p>
@@ -2365,7 +2491,7 @@
         <w:pStyle w:val="Heading1"/>
       </w:pPr>
       <w:r>
-        <w:t>5. Plantillas de dispositivo (DTDL)</w:t>
+        <w:t>6. Plantillas de dispositivo (DTDL)</w:t>
       </w:r>
     </w:p>
     <w:p>
@@ -2930,7 +3056,7 @@
         <w:pStyle w:val="Heading1"/>
       </w:pPr>
       <w:r>
-        <w:t>6. Asincronía, desconexiones y operación en vivo</w:t>
+        <w:t>7. Asincronía, desconexiones y operación en vivo</w:t>
       </w:r>
     </w:p>
     <w:p>
@@ -3321,7 +3447,7 @@
         <w:pStyle w:val="Heading1"/>
       </w:pPr>
       <w:r>
-        <w:t>7. Cuarto de control</w:t>
+        <w:t>8. Cuarto de control</w:t>
       </w:r>
     </w:p>
     <w:p>
@@ -3546,7 +3672,7 @@
         <w:pStyle w:val="Heading1"/>
       </w:pPr>
       <w:r>
-        <w:t>8. Telemetría por día</w:t>
+        <w:t>9. Telemetría por día</w:t>
       </w:r>
     </w:p>
     <w:p>
@@ -4520,7 +4646,7 @@
         <w:drawing>
           <wp:inline xmlns:a="http://schemas.openxmlformats.org/drawingml/2006/main" xmlns:pic="http://schemas.openxmlformats.org/drawingml/2006/picture">
             <wp:extent cx="5940000" cy="2138400"/>
-            <wp:docPr id="3" name="Picture 3"/>
+            <wp:docPr id="5" name="Picture 5"/>
             <wp:cNvGraphicFramePr>
               <a:graphicFrameLocks noChangeAspect="1"/>
             </wp:cNvGraphicFramePr>
@@ -4529,124 +4655,6 @@
                 <pic:pic>
                   <pic:nvPicPr>
                     <pic:cNvPr id="0" name="01_humedad_suelo.png"/>
-                    <pic:cNvPicPr/>
-                  </pic:nvPicPr>
-                  <pic:blipFill>
-                    <a:blip r:embed="rId11"/>
-                    <a:stretch>
-                      <a:fillRect/>
-                    </a:stretch>
-                  </pic:blipFill>
-                  <pic:spPr>
-                    <a:xfrm>
-                      <a:off x="0" y="0"/>
-                      <a:ext cx="5940000" cy="2138400"/>
-                    </a:xfrm>
-                    <a:prstGeom prst="rect"/>
-                  </pic:spPr>
-                </pic:pic>
-              </a:graphicData>
-            </a:graphic>
-          </wp:inline>
-        </w:drawing>
-      </w:r>
-    </w:p>
-    <w:p>
-      <w:pPr>
-        <w:jc w:val="center"/>
-      </w:pPr>
-      <w:r>
-        <w:rPr>
-          <w:i/>
-          <w:sz w:val="18"/>
-        </w:rPr>
-        <w:t>Figura 2. Humedad del suelo por lote.</w:t>
-      </w:r>
-    </w:p>
-    <w:p>
-      <w:r>
-        <w:rPr>
-          <w:b w:val="0"/>
-        </w:rPr>
-        <w:t>La humedad de suelo tiene un patron de diente de sierra: baja poco a poco por la evapotranspiracion y sube de golpe cuando el simulador marca un riego. El lote 1 usa el simulador nativo de IoT Central, que genera numeros aleatorios en todo el rango de la variable, por eso se mueve mas brusco que el lote 3, que corre el script propio con limites realistas. Lote de cultivo 1: se movio entre 1.6 y 99.7, con un promedio de 50.0. El valor mas alto se dio el 27/09 a las 02:36 y el mas bajo el 27/09 a las 07:59. Lote de cultivo 3: se movio entre 22.0 y 42.3, con un promedio de 25.7. El valor mas alto se dio el 23/09 a las 22:45 y el mas bajo el 23/09 a las 14:27.</w:t>
-      </w:r>
-    </w:p>
-    <w:p>
-      <w:pPr>
-        <w:jc w:val="center"/>
-      </w:pPr>
-      <w:r>
-        <w:drawing>
-          <wp:inline xmlns:a="http://schemas.openxmlformats.org/drawingml/2006/main" xmlns:pic="http://schemas.openxmlformats.org/drawingml/2006/picture">
-            <wp:extent cx="5940000" cy="2138400"/>
-            <wp:docPr id="4" name="Picture 4"/>
-            <wp:cNvGraphicFramePr>
-              <a:graphicFrameLocks noChangeAspect="1"/>
-            </wp:cNvGraphicFramePr>
-            <a:graphic>
-              <a:graphicData uri="http://schemas.openxmlformats.org/drawingml/2006/picture">
-                <pic:pic>
-                  <pic:nvPicPr>
-                    <pic:cNvPr id="0" name="02_temperatura_suelo.png"/>
-                    <pic:cNvPicPr/>
-                  </pic:nvPicPr>
-                  <pic:blipFill>
-                    <a:blip r:embed="rId12"/>
-                    <a:stretch>
-                      <a:fillRect/>
-                    </a:stretch>
-                  </pic:blipFill>
-                  <pic:spPr>
-                    <a:xfrm>
-                      <a:off x="0" y="0"/>
-                      <a:ext cx="5940000" cy="2138400"/>
-                    </a:xfrm>
-                    <a:prstGeom prst="rect"/>
-                  </pic:spPr>
-                </pic:pic>
-              </a:graphicData>
-            </a:graphic>
-          </wp:inline>
-        </w:drawing>
-      </w:r>
-    </w:p>
-    <w:p>
-      <w:pPr>
-        <w:jc w:val="center"/>
-      </w:pPr>
-      <w:r>
-        <w:rPr>
-          <w:i/>
-          <w:sz w:val="18"/>
-        </w:rPr>
-        <w:t>Figura 3. Temperatura del suelo.</w:t>
-      </w:r>
-    </w:p>
-    <w:p>
-      <w:r>
-        <w:rPr>
-          <w:b w:val="0"/>
-        </w:rPr>
-        <w:t>Esta variable solo la envian el lote 1 (simulador nativo) y el lote 2, que todavia esta pendiente de conectar por Wokwi; por eso la grafica muestra un solo dispositivo. Lote de cultivo 1: se movio entre 1.7 y 99.0, con un promedio de 50.0. El valor mas alto se dio el 27/09 a las 01:01 y el mas bajo el 22/09 a las 21:33.</w:t>
-      </w:r>
-    </w:p>
-    <w:p>
-      <w:pPr>
-        <w:jc w:val="center"/>
-      </w:pPr>
-      <w:r>
-        <w:drawing>
-          <wp:inline xmlns:a="http://schemas.openxmlformats.org/drawingml/2006/main" xmlns:pic="http://schemas.openxmlformats.org/drawingml/2006/picture">
-            <wp:extent cx="5940000" cy="2138400"/>
-            <wp:docPr id="5" name="Picture 5"/>
-            <wp:cNvGraphicFramePr>
-              <a:graphicFrameLocks noChangeAspect="1"/>
-            </wp:cNvGraphicFramePr>
-            <a:graphic>
-              <a:graphicData uri="http://schemas.openxmlformats.org/drawingml/2006/picture">
-                <pic:pic>
-                  <pic:nvPicPr>
-                    <pic:cNvPr id="0" name="03_dosel_temperatura.png"/>
                     <pic:cNvPicPr/>
                   </pic:nvPicPr>
                   <pic:blipFill>
@@ -4678,7 +4686,7 @@
           <w:i/>
           <w:sz w:val="18"/>
         </w:rPr>
-        <w:t>Figura 4. Temperatura bajo sombra.</w:t>
+        <w:t>Figura 4. Humedad del suelo por lote.</w:t>
       </w:r>
     </w:p>
     <w:p>
@@ -4686,7 +4694,7 @@
         <w:rPr>
           <w:b w:val="0"/>
         </w:rPr>
-        <w:t>Bajo el dosel de sombra la temperatura y la humedad se mueven al contrario: cuando una sube la otra baja, porque las dos dependen de la misma hora del dia. Dosel de sombra: se movio entre 21.1 y 28.9, con un promedio de 24.9. El valor mas alto se dio el 25/09 a las 13:37 y el mas bajo el 27/09 a las 01:50. En cuanto a la humedad relativa, se movio entre 66.5 y 93.5, con un promedio de 80.4. El valor mas alto se dio el 24/09 a las 02:08 y el mas bajo el 26/09 a las 13:56.</w:t>
+        <w:t>La humedad de suelo tiene un patron de diente de sierra: baja poco a poco por la evapotranspiracion y sube de golpe cuando el simulador marca un riego. El lote 1 usa el simulador nativo de IoT Central, que genera numeros aleatorios en todo el rango de la variable, por eso se mueve mas brusco que el lote 3, que corre el script propio con limites realistas. Lote de cultivo 1: se movio entre 1.6 y 99.7, con un promedio de 50.0. El valor mas alto se dio el 27/09 a las 02:36 y el mas bajo el 27/09 a las 07:59. Lote de cultivo 3: se movio entre 22.0 y 42.3, con un promedio de 25.7. El valor mas alto se dio el 23/09 a las 22:45 y el mas bajo el 23/09 a las 14:27.</w:t>
       </w:r>
     </w:p>
     <w:p>
@@ -4705,7 +4713,7 @@
               <a:graphicData uri="http://schemas.openxmlformats.org/drawingml/2006/picture">
                 <pic:pic>
                   <pic:nvPicPr>
-                    <pic:cNvPr id="0" name="04_meteo_temperatura.png"/>
+                    <pic:cNvPr id="0" name="02_temperatura_suelo.png"/>
                     <pic:cNvPicPr/>
                   </pic:nvPicPr>
                   <pic:blipFill>
@@ -4737,7 +4745,7 @@
           <w:i/>
           <w:sz w:val="18"/>
         </w:rPr>
-        <w:t>Figura 5. Temperatura de la API Open-Meteo.</w:t>
+        <w:t>Figura 5. Temperatura del suelo.</w:t>
       </w:r>
     </w:p>
     <w:p>
@@ -4745,7 +4753,7 @@
         <w:rPr>
           <w:b w:val="0"/>
         </w:rPr>
-        <w:t>Estos datos vienen directo de la API de Open-Meteo, sin simular nada. Meteorologia del predio: se movio entre 21.2 y 29.9, con un promedio de 24.5. El valor mas alto se dio el 23/09 a las 13:45 y el mas bajo el 24/09 a las 04:47. En total llovio 74.2 mm durante la ventana capturada, con lluvia registrada el 27/09, 26/09, 25/09, 24/09, 23/09.</w:t>
+        <w:t>Esta variable solo la envian el lote 1 (simulador nativo) y el lote 2, que todavia esta pendiente de conectar por Wokwi; por eso la grafica muestra un solo dispositivo. Lote de cultivo 1: se movio entre 1.7 y 99.0, con un promedio de 50.0. El valor mas alto se dio el 27/09 a las 01:01 y el mas bajo el 22/09 a las 21:33.</w:t>
       </w:r>
     </w:p>
     <w:p>
@@ -4764,7 +4772,7 @@
               <a:graphicData uri="http://schemas.openxmlformats.org/drawingml/2006/picture">
                 <pic:pic>
                   <pic:nvPicPr>
-                    <pic:cNvPr id="0" name="05_aire_pm25.png"/>
+                    <pic:cNvPr id="0" name="03_dosel_temperatura.png"/>
                     <pic:cNvPicPr/>
                   </pic:nvPicPr>
                   <pic:blipFill>
@@ -4796,7 +4804,7 @@
           <w:i/>
           <w:sz w:val="18"/>
         </w:rPr>
-        <w:t>Figura 6. PM2.5 desde Atlas Weather.</w:t>
+        <w:t>Figura 6. Temperatura bajo sombra.</w:t>
       </w:r>
     </w:p>
     <w:p>
@@ -4804,7 +4812,7 @@
         <w:rPr>
           <w:b w:val="0"/>
         </w:rPr>
-        <w:t>El PM2.5 y el indice de calidad del aire salen de Azure Maps Weather (Atlas Weather) para la ubicacion del predio. Calidad de aire: se movio entre 7.7 y 24.2, con un promedio de 13.9. El valor mas alto se dio el 25/09 a las 08:42 y el mas bajo el 26/09 a las 07:47. El indice de calidad de aire (AQI) llego a un maximo de 81 en la ventana capturada.</w:t>
+        <w:t>Bajo el dosel de sombra la temperatura y la humedad se mueven al contrario: cuando una sube la otra baja, porque las dos dependen de la misma hora del dia. Dosel de sombra: se movio entre 21.1 y 28.9, con un promedio de 24.9. El valor mas alto se dio el 25/09 a las 13:37 y el mas bajo el 27/09 a las 01:50. En cuanto a la humedad relativa, se movio entre 66.5 y 93.5, con un promedio de 80.4. El valor mas alto se dio el 24/09 a las 02:08 y el mas bajo el 26/09 a las 13:56.</w:t>
       </w:r>
     </w:p>
     <w:p>
@@ -4823,7 +4831,7 @@
               <a:graphicData uri="http://schemas.openxmlformats.org/drawingml/2006/picture">
                 <pic:pic>
                   <pic:nvPicPr>
-                    <pic:cNvPr id="0" name="06_fermentacion_temperatura.png"/>
+                    <pic:cNvPr id="0" name="04_meteo_temperatura.png"/>
                     <pic:cNvPicPr/>
                   </pic:nvPicPr>
                   <pic:blipFill>
@@ -4855,7 +4863,7 @@
           <w:i/>
           <w:sz w:val="18"/>
         </w:rPr>
-        <w:t>Figura 7. Temperatura de la caja de fermentación.</w:t>
+        <w:t>Figura 7. Temperatura de la API Open-Meteo.</w:t>
       </w:r>
     </w:p>
     <w:p>
@@ -4863,7 +4871,7 @@
         <w:rPr>
           <w:b w:val="0"/>
         </w:rPr>
-        <w:t>La temperatura de la caja de fermentacion sube poco a poco a medida que pasan los dias del proceso: empezo en 30.5 el 23/09 y llego a 34.2 el 27/09, con un maximo de 38.0. Esto es porque el script simula el avance de la fermentacion, que se calienta con los dias.</w:t>
+        <w:t>Estos datos vienen directo de la API de Open-Meteo, sin simular nada. Meteorologia del predio: se movio entre 21.2 y 29.9, con un promedio de 24.5. El valor mas alto se dio el 23/09 a las 13:45 y el mas bajo el 24/09 a las 04:47. En total llovio 74.2 mm durante la ventana capturada, con lluvia registrada el 27/09, 26/09, 25/09, 24/09, 23/09.</w:t>
       </w:r>
     </w:p>
     <w:p>
@@ -4882,7 +4890,7 @@
               <a:graphicData uri="http://schemas.openxmlformats.org/drawingml/2006/picture">
                 <pic:pic>
                   <pic:nvPicPr>
-                    <pic:cNvPr id="0" name="07_bodega_temperatura.png"/>
+                    <pic:cNvPr id="0" name="05_aire_pm25.png"/>
                     <pic:cNvPicPr/>
                   </pic:nvPicPr>
                   <pic:blipFill>
@@ -4914,7 +4922,7 @@
           <w:i/>
           <w:sz w:val="18"/>
         </w:rPr>
-        <w:t>Figura 8. Temperatura de la bodega.</w:t>
+        <w:t>Figura 8. PM2.5 desde Atlas Weather.</w:t>
       </w:r>
     </w:p>
     <w:p>
@@ -4922,7 +4930,7 @@
         <w:rPr>
           <w:b w:val="0"/>
         </w:rPr>
-        <w:t>Perimetro y bodega: se movio entre 22.7 y 29.8, con un promedio de 26.2. El valor mas alto se dio el 23/09 a las 13:57 y el mas bajo el 24/09 a las 01:41. Ademas se registraron 199 lecturas con la puerta abierta y 313 con movimiento detectado, que son los eventos que revisan las reglas de seguridad de la bodega.</w:t>
+        <w:t>El PM2.5 y el indice de calidad del aire salen de Azure Maps Weather (Atlas Weather) para la ubicacion del predio. Calidad de aire: se movio entre 7.7 y 24.2, con un promedio de 13.9. El valor mas alto se dio el 25/09 a las 08:42 y el mas bajo el 26/09 a las 07:47. El indice de calidad de aire (AQI) llego a un maximo de 81 en la ventana capturada.</w:t>
       </w:r>
     </w:p>
     <w:p>
@@ -4941,7 +4949,7 @@
               <a:graphicData uri="http://schemas.openxmlformats.org/drawingml/2006/picture">
                 <pic:pic>
                   <pic:nvPicPr>
-                    <pic:cNvPr id="0" name="08_estacion_humedad_foliar.png"/>
+                    <pic:cNvPr id="0" name="06_fermentacion_temperatura.png"/>
                     <pic:cNvPicPr/>
                   </pic:nvPicPr>
                   <pic:blipFill>
@@ -4973,7 +4981,125 @@
           <w:i/>
           <w:sz w:val="18"/>
         </w:rPr>
-        <w:t>Figura 9. Humedad foliar de la estación de campo.</w:t>
+        <w:t>Figura 9. Temperatura de la caja de fermentación.</w:t>
+      </w:r>
+    </w:p>
+    <w:p>
+      <w:r>
+        <w:rPr>
+          <w:b w:val="0"/>
+        </w:rPr>
+        <w:t>La temperatura de la caja de fermentacion sube poco a poco a medida que pasan los dias del proceso: empezo en 30.5 el 23/09 y llego a 34.2 el 27/09, con un maximo de 38.0. Esto es porque el script simula el avance de la fermentacion, que se calienta con los dias.</w:t>
+      </w:r>
+    </w:p>
+    <w:p>
+      <w:pPr>
+        <w:jc w:val="center"/>
+      </w:pPr>
+      <w:r>
+        <w:drawing>
+          <wp:inline xmlns:a="http://schemas.openxmlformats.org/drawingml/2006/main" xmlns:pic="http://schemas.openxmlformats.org/drawingml/2006/picture">
+            <wp:extent cx="5940000" cy="2138400"/>
+            <wp:docPr id="11" name="Picture 11"/>
+            <wp:cNvGraphicFramePr>
+              <a:graphicFrameLocks noChangeAspect="1"/>
+            </wp:cNvGraphicFramePr>
+            <a:graphic>
+              <a:graphicData uri="http://schemas.openxmlformats.org/drawingml/2006/picture">
+                <pic:pic>
+                  <pic:nvPicPr>
+                    <pic:cNvPr id="0" name="07_bodega_temperatura.png"/>
+                    <pic:cNvPicPr/>
+                  </pic:nvPicPr>
+                  <pic:blipFill>
+                    <a:blip r:embed="rId19"/>
+                    <a:stretch>
+                      <a:fillRect/>
+                    </a:stretch>
+                  </pic:blipFill>
+                  <pic:spPr>
+                    <a:xfrm>
+                      <a:off x="0" y="0"/>
+                      <a:ext cx="5940000" cy="2138400"/>
+                    </a:xfrm>
+                    <a:prstGeom prst="rect"/>
+                  </pic:spPr>
+                </pic:pic>
+              </a:graphicData>
+            </a:graphic>
+          </wp:inline>
+        </w:drawing>
+      </w:r>
+    </w:p>
+    <w:p>
+      <w:pPr>
+        <w:jc w:val="center"/>
+      </w:pPr>
+      <w:r>
+        <w:rPr>
+          <w:i/>
+          <w:sz w:val="18"/>
+        </w:rPr>
+        <w:t>Figura 10. Temperatura de la bodega.</w:t>
+      </w:r>
+    </w:p>
+    <w:p>
+      <w:r>
+        <w:rPr>
+          <w:b w:val="0"/>
+        </w:rPr>
+        <w:t>Perimetro y bodega: se movio entre 22.7 y 29.8, con un promedio de 26.2. El valor mas alto se dio el 23/09 a las 13:57 y el mas bajo el 24/09 a las 01:41. Ademas se registraron 199 lecturas con la puerta abierta y 313 con movimiento detectado, que son los eventos que revisan las reglas de seguridad de la bodega.</w:t>
+      </w:r>
+    </w:p>
+    <w:p>
+      <w:pPr>
+        <w:jc w:val="center"/>
+      </w:pPr>
+      <w:r>
+        <w:drawing>
+          <wp:inline xmlns:a="http://schemas.openxmlformats.org/drawingml/2006/main" xmlns:pic="http://schemas.openxmlformats.org/drawingml/2006/picture">
+            <wp:extent cx="5940000" cy="2138400"/>
+            <wp:docPr id="12" name="Picture 12"/>
+            <wp:cNvGraphicFramePr>
+              <a:graphicFrameLocks noChangeAspect="1"/>
+            </wp:cNvGraphicFramePr>
+            <a:graphic>
+              <a:graphicData uri="http://schemas.openxmlformats.org/drawingml/2006/picture">
+                <pic:pic>
+                  <pic:nvPicPr>
+                    <pic:cNvPr id="0" name="08_estacion_humedad_foliar.png"/>
+                    <pic:cNvPicPr/>
+                  </pic:nvPicPr>
+                  <pic:blipFill>
+                    <a:blip r:embed="rId20"/>
+                    <a:stretch>
+                      <a:fillRect/>
+                    </a:stretch>
+                  </pic:blipFill>
+                  <pic:spPr>
+                    <a:xfrm>
+                      <a:off x="0" y="0"/>
+                      <a:ext cx="5940000" cy="2138400"/>
+                    </a:xfrm>
+                    <a:prstGeom prst="rect"/>
+                  </pic:spPr>
+                </pic:pic>
+              </a:graphicData>
+            </a:graphic>
+          </wp:inline>
+        </w:drawing>
+      </w:r>
+    </w:p>
+    <w:p>
+      <w:pPr>
+        <w:jc w:val="center"/>
+      </w:pPr>
+      <w:r>
+        <w:rPr>
+          <w:i/>
+          <w:sz w:val="18"/>
+        </w:rPr>
+        <w:t>Figura 11. Humedad foliar de la estación de campo.</w:t>
       </w:r>
     </w:p>
     <w:p>
@@ -4989,7 +5115,7 @@
         <w:pStyle w:val="Heading1"/>
       </w:pPr>
       <w:r>
-        <w:t>9. Repositorio</w:t>
+        <w:t>10. Repositorio</w:t>
       </w:r>
     </w:p>
     <w:p>
@@ -4998,22 +5124,6 @@
           <w:b w:val="0"/>
         </w:rPr>
         <w:t>El repositorio está en github.com/Rafaariasxd/parcial1-iot-central-cacao y contiene el README, los modelos DTDL (modelo), los scripts de cada origen (scripts), los proyectos de Wokwi (wokwi), los datos exportados (datos) y las evidencias. Las claves y el ID scope no se suben: se leen de variables de entorno y de archivos secrets.h locales, que están en el .gitignore.</w:t>
-      </w:r>
-    </w:p>
-    <w:p>
-      <w:pPr>
-        <w:pStyle w:val="Heading1"/>
-      </w:pPr>
-      <w:r>
-        <w:t>10. Sustentación</w:t>
-      </w:r>
-    </w:p>
-    <w:p>
-      <w:r>
-        <w:rPr>
-          <w:b w:val="0"/>
-        </w:rPr>
-        <w:t>Se ejecutan dos códigos en dos equipos distintos: un script de Python en el portátil y el ESP32 de Wokwi en el navegador, mostrando en IoT Central los estados de conexión y la telemetría en vivo.</w:t>
       </w:r>
     </w:p>
     <w:sectPr>

</xml_diff>

<commit_message>
Rehace el plano de la finca: mejor detalle, sin brujula fea ni recortes
</commit_message>
<xml_diff>
--- a/documento/Parcial1_IoT_Central.docx
+++ b/documento/Parcial1_IoT_Central.docx
@@ -470,7 +470,7 @@
       <w:r>
         <w:drawing>
           <wp:inline xmlns:a="http://schemas.openxmlformats.org/drawingml/2006/main" xmlns:pic="http://schemas.openxmlformats.org/drawingml/2006/picture">
-            <wp:extent cx="5760000" cy="4189091"/>
+            <wp:extent cx="5760000" cy="4128000"/>
             <wp:docPr id="2" name="Picture 2"/>
             <wp:cNvGraphicFramePr>
               <a:graphicFrameLocks noChangeAspect="1"/>
@@ -491,7 +491,7 @@
                   <pic:spPr>
                     <a:xfrm>
                       <a:off x="0" y="0"/>
-                      <a:ext cx="5760000" cy="4189091"/>
+                      <a:ext cx="5760000" cy="4128000"/>
                     </a:xfrm>
                     <a:prstGeom prst="rect"/>
                   </pic:spPr>

</xml_diff>

<commit_message>
Analisis de graficas mas variado, sin plantilla repetida
</commit_message>
<xml_diff>
--- a/documento/Parcial1_IoT_Central.docx
+++ b/documento/Parcial1_IoT_Central.docx
@@ -543,7 +543,7 @@
         <w:pStyle w:val="Heading2"/>
       </w:pPr>
       <w:r>
-        <w:t>Arquitectura de referencia</w:t>
+        <w:t>Diagrama</w:t>
       </w:r>
     </w:p>
     <w:p>
@@ -4694,7 +4694,7 @@
         <w:rPr>
           <w:b w:val="0"/>
         </w:rPr>
-        <w:t>La humedad de suelo tiene un patron de diente de sierra: baja poco a poco por la evapotranspiracion y sube de golpe cuando el simulador marca un riego. El lote 1 usa el simulador nativo de IoT Central, que genera numeros aleatorios en todo el rango de la variable, por eso se mueve mas brusco que el lote 3, que corre el script propio con limites realistas. Lote de cultivo 1: se movio entre 1.6 y 99.7, con un promedio de 50.0. El valor mas alto se dio el 27/09 a las 02:36 y el mas bajo el 27/09 a las 07:59. Lote de cultivo 3: se movio entre 22.0 y 42.3, con un promedio de 25.7. El valor mas alto se dio el 23/09 a las 22:45 y el mas bajo el 23/09 a las 14:27.</w:t>
+        <w:t>La humedad de suelo tiene forma de diente de sierra: baja poco a poco por la evapotranspiración y sube de golpe cuando el simulador marca un riego. El lote 1 usa el simulador nativo de IoT Central, que genera valores al azar en todo el rango permitido, por eso llega a picos de 100 % y bajadas hasta 2 % (los dos el 27/09, apenas unas horas de diferencia). El lote 3, que corre el script propio con límites realistas, se mantuvo mucho más parejo: entre 22 % y 42 %, con un promedio de 26 %.</w:t>
       </w:r>
     </w:p>
     <w:p>
@@ -4753,7 +4753,7 @@
         <w:rPr>
           <w:b w:val="0"/>
         </w:rPr>
-        <w:t>Esta variable solo la envian el lote 1 (simulador nativo) y el lote 2, que todavia esta pendiente de conectar por Wokwi; por eso la grafica muestra un solo dispositivo. Lote de cultivo 1: se movio entre 1.7 y 99.0, con un promedio de 50.0. El valor mas alto se dio el 27/09 a las 01:01 y el mas bajo el 22/09 a las 21:33.</w:t>
+        <w:t>Esta variable solo la mandan el lote 1 (simulador nativo) y el lote 2, que todavía está pendiente de conectar por Wokwi, así que en la gráfica aparece un solo dispositivo. El máximo se dio el 27/09 a las 01:01 (99 grados) y el mínimo el 22/09 a las 21:33 (2 grados); otra vez se nota que el simulador nativo no respeta un rango realista de temperatura de suelo, porque salta entre valores muy bajos y muy altos de un rato a otro.</w:t>
       </w:r>
     </w:p>
     <w:p>
@@ -4812,7 +4812,7 @@
         <w:rPr>
           <w:b w:val="0"/>
         </w:rPr>
-        <w:t>Bajo el dosel de sombra la temperatura y la humedad se mueven al contrario: cuando una sube la otra baja, porque las dos dependen de la misma hora del dia. Dosel de sombra: se movio entre 21.1 y 28.9, con un promedio de 24.9. El valor mas alto se dio el 25/09 a las 13:37 y el mas bajo el 27/09 a las 01:50. En cuanto a la humedad relativa, se movio entre 66.5 y 93.5, con un promedio de 80.4. El valor mas alto se dio el 24/09 a las 02:08 y el mas bajo el 26/09 a las 13:56.</w:t>
+        <w:t>Bajo el dosel de sombra la temperatura y la humedad van en contra: cuando una sube la otra baja, porque las dos siguen la misma hora del día. La temperatura se mantuvo entre 21.1 y 28.9 °C, con el punto más caliente el 25/09 a las 13:37. La humedad relativa fue al revés: subió hasta 94 % de madrugada (24/09, 02:08) y bajó a 66 % al medio día.</w:t>
       </w:r>
     </w:p>
     <w:p>
@@ -4871,7 +4871,7 @@
         <w:rPr>
           <w:b w:val="0"/>
         </w:rPr>
-        <w:t>Estos datos vienen directo de la API de Open-Meteo, sin simular nada. Meteorologia del predio: se movio entre 21.2 y 29.9, con un promedio de 24.5. El valor mas alto se dio el 23/09 a las 13:45 y el mas bajo el 24/09 a las 04:47. En total llovio 74.2 mm durante la ventana capturada, con lluvia registrada el 27/09, 26/09, 25/09, 24/09, 23/09.</w:t>
+        <w:t>Esta serie no la simula nada: llega directo de la API de Open-Meteo para las coordenadas del predio. La temperatura del aire estuvo entre 21.2 y 29.9 °C, con el pico el 23/09 a las 13:45. En total llovió 74.2 mm durante la ventana capturada, repartidos en 5 de los días con datos (23/09, 24/09, 25/09, 26/09, 27/09).</w:t>
       </w:r>
     </w:p>
     <w:p>
@@ -4930,7 +4930,7 @@
         <w:rPr>
           <w:b w:val="0"/>
         </w:rPr>
-        <w:t>El PM2.5 y el indice de calidad del aire salen de Azure Maps Weather (Atlas Weather) para la ubicacion del predio. Calidad de aire: se movio entre 7.7 y 24.2, con un promedio de 13.9. El valor mas alto se dio el 25/09 a las 08:42 y el mas bajo el 26/09 a las 07:47. El indice de calidad de aire (AQI) llego a un maximo de 81 en la ventana capturada.</w:t>
+        <w:t>El PM2.5 y el índice de calidad del aire vienen de Azure Maps Weather (Atlas Weather), consultado para la ubicación de la finca. El PM2.5 se mantuvo bajo casi toda la ventana, entre 7.7 y 24.2 (promedio 13.9), y el índice de calidad del aire no pasó de 81, es decir que el aire de la zona se mantuvo en niveles aceptables.</w:t>
       </w:r>
     </w:p>
     <w:p>
@@ -4989,7 +4989,7 @@
         <w:rPr>
           <w:b w:val="0"/>
         </w:rPr>
-        <w:t>La temperatura de la caja de fermentacion sube poco a poco a medida que pasan los dias del proceso: empezo en 30.5 el 23/09 y llego a 34.2 el 27/09, con un maximo de 38.0. Esto es porque el script simula el avance de la fermentacion, que se calienta con los dias.</w:t>
+        <w:t>La temperatura de la caja sube poco a poco a medida que avanza la fermentación: arrancó en 30.5 °C el 23/09 y para el 27/09 ya iba en 34.2 °C, con un pico de 38.0. Esto pasa porque el script simula el calentamiento normal del proceso de fermentación del cacao con el paso de los días, no una lectura tomada al azar.</w:t>
       </w:r>
     </w:p>
     <w:p>
@@ -5048,7 +5048,7 @@
         <w:rPr>
           <w:b w:val="0"/>
         </w:rPr>
-        <w:t>Perimetro y bodega: se movio entre 22.7 y 29.8, con un promedio de 26.2. El valor mas alto se dio el 23/09 a las 13:57 y el mas bajo el 24/09 a las 01:41. Ademas se registraron 199 lecturas con la puerta abierta y 313 con movimiento detectado, que son los eventos que revisan las reglas de seguridad de la bodega.</w:t>
+        <w:t>La temperatura de la bodega osciló entre 22.7 y 29.8 °C, con el pico el 23/09 a las 13:57. En la ventana capturada se registraron 199 lecturas con la puerta abierta y 313 con movimiento detectado; esos son justo los eventos que la regla de alerta de la bodega está vigilando.</w:t>
       </w:r>
     </w:p>
     <w:p>
@@ -5107,7 +5107,7 @@
         <w:rPr>
           <w:b w:val="0"/>
         </w:rPr>
-        <w:t>La humedad foliar sube cuando el script simula lluvia en la tarde y baja el resto del dia. Estacion de campo: se movio entre 5.0 y 99.9, con un promedio de 30.8. El valor mas alto se dio el 26/09 a las 14:25 y el mas bajo el 23/09 a las 23:30. La lluvia acumulada del lote en la ventana capturada fue de 44.8 mm.</w:t>
+        <w:t>La humedad foliar sube cuando el script simula lluvia en la tarde y vuelve a bajar el resto del día, por eso la línea se ve tan dentada: llegó a 100 % el 26/09 a las 14:25 y bajó hasta 5 % en las horas secas. La lluvia acumulada del lote en toda la ventana fue de 44.8 mm.</w:t>
       </w:r>
     </w:p>
     <w:p>

</xml_diff>

<commit_message>
Quita el estilo de lista-entre-parentesis en tres parrafos
</commit_message>
<xml_diff>
--- a/documento/Parcial1_IoT_Central.docx
+++ b/documento/Parcial1_IoT_Central.docx
@@ -610,7 +610,7 @@
         <w:rPr>
           <w:b w:val="0"/>
         </w:rPr>
-        <w:t>Mediante la conexión a Internet los datos llegan a Azure IoT Central, donde el servicio de aprovisionamiento (DPS) asigna cada dispositivo al IoT Hub. Desde ahí los datos siguen la ruta caliente, tibia y fría descrita en la arquitectura del servicio, sobre una capa de servicios PaaS que aporta disponibilidad, escalabilidad y recuperación ante desastres. En la experiencia web de administración se gestionan los dispositivos (datos sin procesar, estado de conectividad, modelado y trabajos), se visualizan y analizan los datos (paneles, analítica y reglas) y se administran los usuarios y las organizaciones.</w:t>
+        <w:t>Mediante la conexión a Internet los datos llegan a Azure IoT Central, donde el servicio de aprovisionamiento (DPS) asigna cada dispositivo al IoT Hub. Desde ahí siguen la ruta caliente, tibia y fría que ya trae el servicio, sobre una capa PaaS que se encarga de la disponibilidad y la recuperación ante fallos sin que uno tenga que montar nada de eso. Y ya en la parte de administración web es donde se ve todo: los dispositivos conectados, el panel con las gráficas y reglas, y quién tiene acceso a la aplicación.</w:t>
       </w:r>
     </w:p>
     <w:p>
@@ -3455,7 +3455,7 @@
         <w:rPr>
           <w:b w:val="0"/>
         </w:rPr>
-        <w:t>El panel Cuarto de control - Finca Cacao muestra el conteo de la flota, siete indicadores (promedio, máximo y mínimo de humedad de suelo, nivel mínimo del tanque, temperatura máxima de la caja, PM2.5 máximo y lluvia acumulada) y doce gráficas de línea con las variables de los ocho tipos de dispositivo. Se creó con un script que usa la API de IoT Central (panel_api.py).</w:t>
+        <w:t>El panel Cuarto de control - Finca Cacao arriba muestra el conteo de la flota y siete KPI: el promedio, el máximo y el mínimo de humedad de suelo, el nivel mínimo del tanque, la temperatura máxima de la caja, el PM2.5 máximo y la lluvia acumulada. Debajo van las doce gráficas de línea, una por cada variable de los ocho tipos de dispositivo. No se armó a mano tile por tile: se hizo con un script (panel_api.py) que llama la API de IoT Central.</w:t>
       </w:r>
     </w:p>
     <w:p>
@@ -5123,7 +5123,15 @@
         <w:rPr>
           <w:b w:val="0"/>
         </w:rPr>
-        <w:t>El repositorio está en github.com/Rafaariasxd/parcial1-iot-central-cacao y contiene el README, los modelos DTDL (modelo), los scripts de cada origen (scripts), los proyectos de Wokwi (wokwi), los datos exportados (datos) y las evidencias. Las claves y el ID scope no se suben: se leen de variables de entorno y de archivos secrets.h locales, que están en el .gitignore.</w:t>
+        <w:t>Todo el código quedó en github.com/Rafaariasxd/parcial1-iot-central-cacao: el modelo DTDL de cada plantilla, los scripts que arman los orígenes, los dos proyectos de Wokwi y los datos que se sacaron de IoT Central para hacer las gráficas de este documento.</w:t>
+      </w:r>
+    </w:p>
+    <w:p>
+      <w:r>
+        <w:rPr>
+          <w:b w:val="0"/>
+        </w:rPr>
+        <w:t>La clave del grupo y el ID scope no quedaron subidos. Cada script los lee de variables de entorno, y los proyectos de Wokwi de un secrets.h que no está en el repo (queda en el .gitignore), así que para correr algo hay que poner ahí la clave propia.</w:t>
       </w:r>
     </w:p>
     <w:sectPr>

</xml_diff>